<commit_message>
Made a few changes
</commit_message>
<xml_diff>
--- a/KaranBedi_Prodigal_AssignmentReport.docx
+++ b/KaranBedi_Prodigal_AssignmentReport.docx
@@ -147,17 +147,23 @@
     </w:p>
     <w:p>
       <w:pPr>
-        <w:rPr>
-          <w:b/>
-          <w:bCs/>
-          <w:color w:val="000000"/>
-          <w:sz w:val="24"/>
-          <w:szCs w:val="24"/>
-        </w:rPr>
-      </w:pPr>
-      <w:r>
-        <w:br w:type="page"/>
-      </w:r>
+        <w:pStyle w:val="Heading2"/>
+      </w:pPr>
+    </w:p>
+    <w:p>
+      <w:pPr>
+        <w:pStyle w:val="Heading2"/>
+      </w:pPr>
+    </w:p>
+    <w:p>
+      <w:pPr>
+        <w:pStyle w:val="Heading2"/>
+      </w:pPr>
+    </w:p>
+    <w:p>
+      <w:pPr>
+        <w:pStyle w:val="Heading2"/>
+      </w:pPr>
     </w:p>
     <w:p>
       <w:pPr>
@@ -624,48 +630,90 @@
     </w:p>
     <w:p>
       <w:pPr>
-        <w:spacing w:before="60" w:after="60"/>
-      </w:pPr>
-      <w:r>
-        <w:t>The results confirmed my hypothesis, but the mechanism is more nuanced than I initially expected. Few-shot improved JSON compliance from 46.7% to 93.3%, a much larger jump than the accuracy improvement from 14.3% to 42.9%. This suggests that the examples primarily taught the model the output protocol rather than improving its underlying sentiment reasoning.</w:t>
-      </w:r>
-    </w:p>
-    <w:p>
-      <w:pPr>
-        <w:spacing w:before="60" w:after="60"/>
-      </w:pPr>
-      <w:r>
-        <w:t>The per-star breakdown makes this clearer. Zero-shot never correctly classified 1-star or 2-star reviews across 9 samples, while few-shot recovered 1-star almost perfectly at 5/6 (83%). The five labelled examples gave the model a calibration anchor for negative-sentiment output that the system-prompt-only approach never established.</w:t>
-      </w:r>
-    </w:p>
-    <w:p>
-      <w:pPr>
-        <w:spacing w:before="60" w:after="60"/>
-      </w:pPr>
-      <w:r>
-        <w:rPr>
-          <w:b/>
-          <w:bCs/>
-        </w:rPr>
+        <w:jc w:val="both"/>
+      </w:pPr>
+      <w:r>
+        <w:t xml:space="preserve">The results show a consistent trade-off between reasoning complexity and output reliability. Direct prompting produced stable outputs but tended to collapse toward mid-range ratings, while </w:t>
+      </w:r>
+      <w:proofErr w:type="spellStart"/>
+      <w:r>
+        <w:t>CoT</w:t>
+      </w:r>
+      <w:proofErr w:type="spellEnd"/>
+      <w:r>
+        <w:t xml:space="preserve"> and </w:t>
+      </w:r>
+      <w:proofErr w:type="spellStart"/>
+      <w:r>
+        <w:t>CoT+few-shot</w:t>
+      </w:r>
+      <w:proofErr w:type="spellEnd"/>
+      <w:r>
+        <w:t xml:space="preserve"> introduced more nuanced reasoning at the cost of increased formatting instability in earlier iterations.</w:t>
+      </w:r>
+    </w:p>
+    <w:p>
+      <w:pPr>
+        <w:jc w:val="both"/>
+      </w:pPr>
+      <w:r>
+        <w:t xml:space="preserve">A key missing piece in the initial analysis was reasoning mismatch. To address this, I manually reviewed the incorrect </w:t>
+      </w:r>
+      <w:proofErr w:type="spellStart"/>
+      <w:r>
+        <w:t>CoT+few-shot</w:t>
+      </w:r>
+      <w:proofErr w:type="spellEnd"/>
+      <w:r>
+        <w:t xml:space="preserve"> predictions. In several cases, the model’s reasoning text correctly identified the sentiment (e.g., highlighting strong negative cues), but the final JSON output assigned a different star rating. This indicates a disconnect between intermediate reasoning and final structured output. In other cases, the reasoning itself was flawed, and in a small number of cases the output was malformed.</w:t>
+      </w:r>
+    </w:p>
+    <w:p>
+      <w:pPr>
+        <w:jc w:val="both"/>
+      </w:pPr>
+      <w:r>
+        <w:t xml:space="preserve">This suggests that for small models like Gemma 2B, </w:t>
+      </w:r>
+      <w:proofErr w:type="spellStart"/>
+      <w:r>
+        <w:t>CoT</w:t>
+      </w:r>
+      <w:proofErr w:type="spellEnd"/>
+      <w:r>
+        <w:t xml:space="preserve"> does not reliably translate reasoning into correct structured predictions. Instead, it introduces an additional failure mode: the model may reason correctly but fail to map that reasoning to the required output format.</w:t>
+      </w:r>
+    </w:p>
+    <w:p>
+      <w:pPr>
+        <w:jc w:val="both"/>
+      </w:pPr>
+      <w:r>
+        <w:t>Another important observation from the notebook (not fully surfaced earlier) is that bare few-shot prompting achieved high structure but poor JSON compliance when not strictly enforced, highlighting that examples alone are insufficient without strong output constraints. This reinforces a broader pattern seen across tasks: structure must be explicitly enforced, not implicitly learned.</w:t>
+      </w:r>
+    </w:p>
+    <w:p>
+      <w:pPr>
+        <w:jc w:val="both"/>
+      </w:pPr>
+      <w:r>
         <w:t xml:space="preserve">Key insight: </w:t>
       </w:r>
-      <w:r>
-        <w:t>Few-shot improves output structure more reliably than it improves reasoning depth. On a 2B model, format compliance is the bottleneck, not sentiment understanding.</w:t>
-      </w:r>
-    </w:p>
-    <w:p>
-      <w:pPr>
-        <w:spacing w:before="60" w:after="60"/>
-      </w:pPr>
-      <w:r>
-        <w:rPr>
-          <w:b/>
-          <w:bCs/>
-        </w:rPr>
-        <w:t xml:space="preserve">Limitation: </w:t>
-      </w:r>
-      <w:r>
-        <w:t>15 samples is a noisy evaluation ceiling set by compute constraints. The directional finding is credible but exact numbers should not be over-interpreted.</w:t>
+      <w:proofErr w:type="spellStart"/>
+      <w:r>
+        <w:t>CoT</w:t>
+      </w:r>
+      <w:proofErr w:type="spellEnd"/>
+      <w:r>
+        <w:t xml:space="preserve"> improves reasoning visibility but introduces alignment risk between reasoning and final output. For small models, structured prompting and format enforcement are more reliable than increasing reasoning complexity.</w:t>
+      </w:r>
+    </w:p>
+    <w:p>
+      <w:pPr>
+        <w:jc w:val="both"/>
+      </w:pPr>
+      <w:r>
+        <w:t>Limitation: This reasoning-mismatch analysis is qualitative and based on a small sample (n=15). However, it highlights a distinct failure mode that is not captured by accuracy metrics alone.</w:t>
       </w:r>
     </w:p>
     <w:p>
@@ -758,7 +806,28 @@
       <w:pPr>
         <w:pStyle w:val="Heading2"/>
       </w:pPr>
-      <w:r>
+    </w:p>
+    <w:p>
+      <w:pPr>
+        <w:pStyle w:val="Heading2"/>
+      </w:pPr>
+    </w:p>
+    <w:p>
+      <w:pPr>
+        <w:pStyle w:val="Heading2"/>
+      </w:pPr>
+    </w:p>
+    <w:p>
+      <w:pPr>
+        <w:pStyle w:val="Heading2"/>
+      </w:pPr>
+    </w:p>
+    <w:p>
+      <w:pPr>
+        <w:pStyle w:val="Heading2"/>
+      </w:pPr>
+      <w:r>
+        <w:lastRenderedPageBreak/>
         <w:t>Results</w:t>
       </w:r>
     </w:p>
@@ -1255,7 +1324,6 @@
         <w:pStyle w:val="Heading2"/>
       </w:pPr>
       <w:r>
-        <w:lastRenderedPageBreak/>
         <w:t>Analysis</w:t>
       </w:r>
     </w:p>
@@ -2259,6 +2327,7 @@
         <w:pStyle w:val="Heading2"/>
       </w:pPr>
       <w:r>
+        <w:lastRenderedPageBreak/>
         <w:t>Analysis</w:t>
       </w:r>
     </w:p>
@@ -2275,11 +2344,7 @@
         <w:spacing w:before="60" w:after="60"/>
       </w:pPr>
       <w:r>
-        <w:t xml:space="preserve">v3 added negation-awareness and sarcasm instructions, which added prompt complexity that the 2B model could not reliably act on. Accuracy fell back to 46.7% while JSON compliance held at 93.3%, suggesting the </w:t>
-      </w:r>
-      <w:r>
-        <w:lastRenderedPageBreak/>
-        <w:t>additional instructions consumed token budget on format-adjacent reasoning rather than improving classification.</w:t>
+        <w:t>v3 added negation-awareness and sarcasm instructions, which added prompt complexity that the 2B model could not reliably act on. Accuracy fell back to 46.7% while JSON compliance held at 93.3%, suggesting the additional instructions consumed token budget on format-adjacent reasoning rather than improving classification.</w:t>
       </w:r>
     </w:p>
     <w:p>
@@ -2992,9 +3057,14 @@
       </w:r>
     </w:p>
     <w:p>
-      <w:r>
-        <w:br w:type="page"/>
-      </w:r>
+      <w:pPr>
+        <w:pStyle w:val="Heading2"/>
+      </w:pPr>
+    </w:p>
+    <w:p>
+      <w:pPr>
+        <w:pStyle w:val="Heading2"/>
+      </w:pPr>
     </w:p>
     <w:p>
       <w:pPr>
@@ -3600,30 +3670,10 @@
     </w:p>
     <w:p>
       <w:pPr>
-        <w:spacing w:before="60" w:after="60"/>
-      </w:pPr>
-    </w:p>
-    <w:p>
-      <w:pPr>
-        <w:rPr>
-          <w:b/>
-          <w:bCs/>
-          <w:color w:val="000000"/>
-          <w:sz w:val="28"/>
-          <w:szCs w:val="28"/>
-        </w:rPr>
-      </w:pPr>
-      <w:r>
-        <w:br w:type="page"/>
-      </w:r>
-    </w:p>
-    <w:p>
-      <w:pPr>
         <w:pStyle w:val="Heading1"/>
         <w:spacing w:before="280"/>
       </w:pPr>
       <w:r>
-        <w:lastRenderedPageBreak/>
         <w:t>7. Trade-offs and Learnings</w:t>
       </w:r>
     </w:p>
@@ -3681,6 +3731,7 @@
           <w:b/>
           <w:bCs/>
         </w:rPr>
+        <w:lastRenderedPageBreak/>
         <w:t xml:space="preserve">API vs local inference. </w:t>
       </w:r>
       <w:r>
@@ -3704,11 +3755,6 @@
     </w:p>
     <w:p>
       <w:pPr>
-        <w:spacing w:before="60" w:after="60"/>
-      </w:pPr>
-    </w:p>
-    <w:p>
-      <w:pPr>
         <w:pStyle w:val="Heading1"/>
         <w:spacing w:before="280"/>
       </w:pPr>
@@ -3751,6 +3797,10 @@
     <w:p>
       <w:pPr>
         <w:spacing w:before="60" w:after="60"/>
+        <w:rPr>
+          <w:b/>
+          <w:bCs/>
+        </w:rPr>
       </w:pPr>
     </w:p>
     <w:p>
@@ -3801,9 +3851,57 @@
         <w:t xml:space="preserve"> in this report.</w:t>
       </w:r>
     </w:p>
+    <w:p>
+      <w:pPr>
+        <w:spacing w:before="60" w:after="60"/>
+        <w:jc w:val="both"/>
+      </w:pPr>
+    </w:p>
+    <w:p>
+      <w:pPr>
+        <w:spacing w:before="60" w:after="60"/>
+        <w:jc w:val="both"/>
+      </w:pPr>
+      <w:r>
+        <w:t xml:space="preserve">I began modularising the local LLM pipeline into a lightweight package: </w:t>
+      </w:r>
+      <w:hyperlink r:id="rId5" w:history="1">
+        <w:r>
+          <w:t>https://pypi.org/project/edgegemma-8gb/0.1.0/</w:t>
+        </w:r>
+      </w:hyperlink>
+    </w:p>
+    <w:p>
+      <w:pPr>
+        <w:spacing w:before="60" w:after="60"/>
+        <w:jc w:val="both"/>
+      </w:pPr>
+      <w:r>
+        <w:t>It encapsulates efficient Gemma 2B loading (8GB VRAM), quantization, and a simple LLM call interface.</w:t>
+      </w:r>
+      <w:r>
+        <w:br/>
+        <w:t>Due to time constraints, this was not fully integrated across all notebooks, as priority was given to completing experiments and ensuring reproducibility.</w:t>
+      </w:r>
+    </w:p>
+    <w:p>
+      <w:pPr>
+        <w:spacing w:before="60" w:after="60"/>
+        <w:jc w:val="both"/>
+      </w:pPr>
+      <w:r>
+        <w:t>This package can serve as a shared backend to remove redundancy and standardise model interaction across tasks.</w:t>
+      </w:r>
+    </w:p>
+    <w:p>
+      <w:pPr>
+        <w:spacing w:before="60" w:after="60"/>
+        <w:jc w:val="both"/>
+      </w:pPr>
+    </w:p>
     <w:sectPr>
       <w:pgSz w:w="12240" w:h="15840"/>
-      <w:pgMar w:top="1080" w:right="1080" w:bottom="1080" w:left="1080" w:header="708" w:footer="708" w:gutter="0"/>
+      <w:pgMar w:top="720" w:right="720" w:bottom="720" w:left="720" w:header="708" w:footer="708" w:gutter="0"/>
       <w:cols w:space="720"/>
       <w:docGrid w:linePitch="360"/>
     </w:sectPr>
@@ -4571,6 +4669,35 @@
       <w:szCs w:val="20"/>
     </w:rPr>
   </w:style>
+  <w:style w:type="paragraph" w:styleId="NormalWeb">
+    <w:name w:val="Normal (Web)"/>
+    <w:basedOn w:val="Normal"/>
+    <w:uiPriority w:val="99"/>
+    <w:semiHidden/>
+    <w:unhideWhenUsed/>
+    <w:rsid w:val="0061297C"/>
+    <w:pPr>
+      <w:spacing w:before="100" w:beforeAutospacing="1" w:after="100" w:afterAutospacing="1"/>
+    </w:pPr>
+    <w:rPr>
+      <w:rFonts w:ascii="Times New Roman" w:eastAsia="Times New Roman" w:hAnsi="Times New Roman" w:cs="Times New Roman"/>
+      <w:sz w:val="24"/>
+      <w:szCs w:val="24"/>
+    </w:rPr>
+  </w:style>
+  <w:style w:type="paragraph" w:customStyle="1" w:styleId="isselectedend">
+    <w:name w:val="isselectedend"/>
+    <w:basedOn w:val="Normal"/>
+    <w:rsid w:val="00EB1B29"/>
+    <w:pPr>
+      <w:spacing w:before="100" w:beforeAutospacing="1" w:after="100" w:afterAutospacing="1"/>
+    </w:pPr>
+    <w:rPr>
+      <w:rFonts w:ascii="Times New Roman" w:eastAsia="Times New Roman" w:hAnsi="Times New Roman" w:cs="Times New Roman"/>
+      <w:sz w:val="24"/>
+      <w:szCs w:val="24"/>
+    </w:rPr>
+  </w:style>
 </w:styles>
 </file>
 

</xml_diff>